<commit_message>
Update assignment IV for revised sorting task
</commit_message>
<xml_diff>
--- a/Задания-с-Исходниками/Задания/IV.docx
+++ b/Задания-с-Исходниками/Задания/IV.docx
@@ -1,6 +1,6 @@
 
 <file path=word/document.xml><?xml version="1.0" encoding="utf-8"?>
-<w:document xmlns:wpc="http://schemas.microsoft.com/office/word/2010/wordprocessingCanvas" xmlns:mc="http://schemas.openxmlformats.org/markup-compatibility/2006" xmlns:o="urn:schemas-microsoft-com:office:office" xmlns:r="http://schemas.openxmlformats.org/officeDocument/2006/relationships" xmlns:m="http://schemas.openxmlformats.org/officeDocument/2006/math" xmlns:v="urn:schemas-microsoft-com:vml" xmlns:wp14="http://schemas.microsoft.com/office/word/2010/wordprocessingDrawing" xmlns:wp="http://schemas.openxmlformats.org/drawingml/2006/wordprocessingDrawing" xmlns:w10="urn:schemas-microsoft-com:office:word" xmlns:w="http://schemas.openxmlformats.org/wordprocessingml/2006/main" xmlns:w14="http://schemas.microsoft.com/office/word/2010/wordml" xmlns:w15="http://schemas.microsoft.com/office/word/2012/wordml" xmlns:wpg="http://schemas.microsoft.com/office/word/2010/wordprocessingGroup" xmlns:wpi="http://schemas.microsoft.com/office/word/2010/wordprocessingInk" xmlns:wne="http://schemas.microsoft.com/office/word/2006/wordml" xmlns:wps="http://schemas.microsoft.com/office/word/2010/wordprocessingShape" mc:Ignorable="w14 w15 wp14">
+<w:document xmlns:wpc="http://schemas.microsoft.com/office/word/2010/wordprocessingCanvas" xmlns:cx="http://schemas.microsoft.com/office/drawing/2014/chartex" xmlns:cx1="http://schemas.microsoft.com/office/drawing/2015/9/8/chartex" xmlns:cx2="http://schemas.microsoft.com/office/drawing/2015/10/21/chartex" xmlns:cx3="http://schemas.microsoft.com/office/drawing/2016/5/9/chartex" xmlns:cx4="http://schemas.microsoft.com/office/drawing/2016/5/10/chartex" xmlns:cx5="http://schemas.microsoft.com/office/drawing/2016/5/11/chartex" xmlns:cx6="http://schemas.microsoft.com/office/drawing/2016/5/12/chartex" xmlns:cx7="http://schemas.microsoft.com/office/drawing/2016/5/13/chartex" xmlns:cx8="http://schemas.microsoft.com/office/drawing/2016/5/14/chartex" xmlns:mc="http://schemas.openxmlformats.org/markup-compatibility/2006" xmlns:aink="http://schemas.microsoft.com/office/drawing/2016/ink" xmlns:am3d="http://schemas.microsoft.com/office/drawing/2017/model3d" xmlns:o="urn:schemas-microsoft-com:office:office" xmlns:r="http://schemas.openxmlformats.org/officeDocument/2006/relationships" xmlns:m="http://schemas.openxmlformats.org/officeDocument/2006/math" xmlns:v="urn:schemas-microsoft-com:vml" xmlns:wp14="http://schemas.microsoft.com/office/word/2010/wordprocessingDrawing" xmlns:wp="http://schemas.openxmlformats.org/drawingml/2006/wordprocessingDrawing" xmlns:w10="urn:schemas-microsoft-com:office:word" xmlns:w="http://schemas.openxmlformats.org/wordprocessingml/2006/main" xmlns:w14="http://schemas.microsoft.com/office/word/2010/wordml" xmlns:w15="http://schemas.microsoft.com/office/word/2012/wordml" xmlns:w16cid="http://schemas.microsoft.com/office/word/2016/wordml/cid" xmlns:w16se="http://schemas.microsoft.com/office/word/2015/wordml/symex" xmlns:wpg="http://schemas.microsoft.com/office/word/2010/wordprocessingGroup" xmlns:wpi="http://schemas.microsoft.com/office/word/2010/wordprocessingInk" xmlns:wne="http://schemas.microsoft.com/office/word/2006/wordml" xmlns:wps="http://schemas.microsoft.com/office/word/2010/wordprocessingShape" mc:Ignorable="w14 w15 w16se w16cid wp14">
   <w:body>
     <w:p>
       <w:pPr>
@@ -33,7 +33,7 @@
           <w:szCs w:val="28"/>
           <w:lang w:val="ru-RU"/>
         </w:rPr>
-        <w:object w:dxaOrig="920" w:dyaOrig="460">
+        <w:object w:dxaOrig="920" w:dyaOrig="460" w14:anchorId="5626C4E7">
           <v:shapetype id="_x0000_t75" coordsize="21600,21600" o:spt="75" o:preferrelative="t" path="m@4@5l@4@11@9@11@9@5xe" filled="f" stroked="f">
             <v:stroke joinstyle="miter"/>
             <v:formulas>
@@ -53,16 +53,31 @@
             <v:path o:extrusionok="f" gradientshapeok="t" o:connecttype="rect"/>
             <o:lock v:ext="edit" aspectratio="t"/>
           </v:shapetype>
-          <v:shape id="_x0000_i1025" type="#_x0000_t75" style="width:46pt;height:23pt" o:ole="">
+          <v:shape id="_x0000_i1025" type="#_x0000_t75" style="width:45.75pt;height:23.25pt" o:ole="">
             <v:imagedata r:id="rId7" o:title=""/>
           </v:shape>
-          <o:OLEObject Type="Embed" ProgID="Equation.DSMT4" ShapeID="_x0000_i1025" DrawAspect="Content" ObjectID="_1537775445" r:id="rId8"/>
+          <o:OLEObject Type="Embed" ProgID="Equation.DSMT4" ShapeID="_x0000_i1025" DrawAspect="Content" ObjectID="_1851605252" r:id="rId8"/>
         </w:object>
       </w:r>
       <w:r>
         <w:rPr>
           <w:sz w:val="28"/>
           <w:szCs w:val="28"/>
+        </w:rPr>
+        <w:t xml:space="preserve"> </w:t>
+      </w:r>
+      <w:r>
+        <w:rPr>
+          <w:sz w:val="28"/>
+          <w:szCs w:val="28"/>
+          <w:lang w:val="ru-RU"/>
+        </w:rPr>
+        <w:t>целых чисел</w:t>
+      </w:r>
+      <w:r>
+        <w:rPr>
+          <w:sz w:val="28"/>
+          <w:szCs w:val="28"/>
           <w:lang w:val="ru-RU"/>
         </w:rPr>
         <w:t>.</w:t>
@@ -97,11 +112,11 @@
           <w:sz w:val="28"/>
           <w:szCs w:val="28"/>
         </w:rPr>
-        <w:object w:dxaOrig="1780" w:dyaOrig="279">
-          <v:shape id="_x0000_i1026" type="#_x0000_t75" style="width:89pt;height:14pt" o:ole="">
+        <w:object w:dxaOrig="1780" w:dyaOrig="279" w14:anchorId="285CA8D6">
+          <v:shape id="_x0000_i1026" type="#_x0000_t75" style="width:89.25pt;height:14.25pt" o:ole="">
             <v:imagedata r:id="rId9" o:title=""/>
           </v:shape>
-          <o:OLEObject Type="Embed" ProgID="Equation.DSMT4" ShapeID="_x0000_i1026" DrawAspect="Content" ObjectID="_1537775446" r:id="rId10"/>
+          <o:OLEObject Type="Embed" ProgID="Equation.DSMT4" ShapeID="_x0000_i1026" DrawAspect="Content" ObjectID="_1851605253" r:id="rId10"/>
         </w:object>
       </w:r>
       <w:r>
@@ -120,6 +135,7 @@
         </w:rPr>
         <w:t xml:space="preserve"> Сравнить эффективность выполнения </w:t>
       </w:r>
+      <w:proofErr w:type="gramStart"/>
       <w:r>
         <w:rPr>
           <w:sz w:val="28"/>
@@ -134,7 +150,16 @@
           <w:szCs w:val="28"/>
           <w:lang w:val="ru-RU"/>
         </w:rPr>
-        <w:t xml:space="preserve"> на основе шаблонов </w:t>
+        <w:t xml:space="preserve"> на</w:t>
+      </w:r>
+      <w:proofErr w:type="gramEnd"/>
+      <w:r>
+        <w:rPr>
+          <w:sz w:val="28"/>
+          <w:szCs w:val="28"/>
+          <w:lang w:val="ru-RU"/>
+        </w:rPr>
+        <w:t xml:space="preserve"> основе шаблонов </w:t>
       </w:r>
       <w:r>
         <w:rPr>
@@ -153,6 +178,7 @@
         </w:rPr>
         <w:t>::</w:t>
       </w:r>
+      <w:proofErr w:type="spellStart"/>
       <w:r>
         <w:rPr>
           <w:rFonts w:ascii="Consolas" w:hAnsi="Consolas" w:cs="Consolas"/>
@@ -164,6 +190,7 @@
         </w:rPr>
         <w:t>sort</w:t>
       </w:r>
+      <w:proofErr w:type="spellEnd"/>
       <w:r>
         <w:rPr>
           <w:rFonts w:ascii="Consolas" w:hAnsi="Consolas" w:cs="Consolas"/>
@@ -174,6 +201,7 @@
         </w:rPr>
         <w:t xml:space="preserve">, </w:t>
       </w:r>
+      <w:proofErr w:type="spellStart"/>
       <w:r>
         <w:rPr>
           <w:rFonts w:ascii="Consolas" w:hAnsi="Consolas" w:cs="Consolas"/>
@@ -183,35 +211,21 @@
           <w:highlight w:val="white"/>
           <w:lang w:val="ru-RU" w:eastAsia="ru-RU" w:bidi="ar-SA"/>
         </w:rPr>
-        <w:t>concurrency::parallel_sort</w:t>
-      </w:r>
+        <w:t>concurrency</w:t>
+      </w:r>
+      <w:proofErr w:type="spellEnd"/>
       <w:r>
         <w:rPr>
           <w:rFonts w:ascii="Consolas" w:hAnsi="Consolas" w:cs="Consolas"/>
           <w:color w:val="000000"/>
           <w:sz w:val="28"/>
           <w:szCs w:val="28"/>
+          <w:highlight w:val="white"/>
           <w:lang w:val="ru-RU" w:eastAsia="ru-RU" w:bidi="ar-SA"/>
         </w:rPr>
-        <w:t>,</w:t>
-      </w:r>
-      <w:r>
-        <w:rPr>
-          <w:rFonts w:ascii="Consolas" w:hAnsi="Consolas" w:cs="Consolas"/>
-          <w:sz w:val="28"/>
-          <w:szCs w:val="28"/>
-          <w:lang w:val="ru-RU"/>
-        </w:rPr>
-        <w:t xml:space="preserve"> </w:t>
-      </w:r>
-      <w:r>
-        <w:rPr>
-          <w:sz w:val="28"/>
-          <w:szCs w:val="28"/>
-          <w:lang w:val="ru-RU"/>
-        </w:rPr>
-        <w:t xml:space="preserve"> </w:t>
-      </w:r>
+        <w:t>::</w:t>
+      </w:r>
+      <w:proofErr w:type="spellStart"/>
       <w:r>
         <w:rPr>
           <w:rFonts w:ascii="Consolas" w:hAnsi="Consolas" w:cs="Consolas"/>
@@ -221,8 +235,9 @@
           <w:highlight w:val="white"/>
           <w:lang w:val="ru-RU" w:eastAsia="ru-RU" w:bidi="ar-SA"/>
         </w:rPr>
-        <w:t>concurrency::parallel_buffered_sort</w:t>
-      </w:r>
+        <w:t>parallel_sort</w:t>
+      </w:r>
+      <w:proofErr w:type="spellEnd"/>
       <w:r>
         <w:rPr>
           <w:rFonts w:ascii="Consolas" w:hAnsi="Consolas" w:cs="Consolas"/>
@@ -231,27 +246,38 @@
           <w:szCs w:val="28"/>
           <w:lang w:val="ru-RU" w:eastAsia="ru-RU" w:bidi="ar-SA"/>
         </w:rPr>
+        <w:t>,</w:t>
+      </w:r>
+      <w:r>
+        <w:rPr>
+          <w:rFonts w:ascii="Consolas" w:hAnsi="Consolas" w:cs="Consolas"/>
+          <w:sz w:val="28"/>
+          <w:szCs w:val="28"/>
+          <w:lang w:val="ru-RU"/>
+        </w:rPr>
         <w:t xml:space="preserve"> </w:t>
       </w:r>
       <w:r>
         <w:rPr>
-          <w:color w:val="000000"/>
-          <w:sz w:val="28"/>
-          <w:szCs w:val="28"/>
-          <w:lang w:val="ru-RU" w:eastAsia="ru-RU" w:bidi="ar-SA"/>
-        </w:rPr>
-        <w:t>и</w:t>
-      </w:r>
+          <w:sz w:val="28"/>
+          <w:szCs w:val="28"/>
+          <w:lang w:val="ru-RU"/>
+        </w:rPr>
+        <w:t xml:space="preserve"> </w:t>
+      </w:r>
+      <w:proofErr w:type="spellStart"/>
       <w:r>
         <w:rPr>
           <w:rFonts w:ascii="Consolas" w:hAnsi="Consolas" w:cs="Consolas"/>
           <w:color w:val="000000"/>
           <w:sz w:val="28"/>
           <w:szCs w:val="28"/>
+          <w:highlight w:val="white"/>
           <w:lang w:val="ru-RU" w:eastAsia="ru-RU" w:bidi="ar-SA"/>
         </w:rPr>
-        <w:t xml:space="preserve"> </w:t>
-      </w:r>
+        <w:t>concurrency</w:t>
+      </w:r>
+      <w:proofErr w:type="spellEnd"/>
       <w:r>
         <w:rPr>
           <w:rFonts w:ascii="Consolas" w:hAnsi="Consolas" w:cs="Consolas"/>
@@ -261,10 +287,9 @@
           <w:highlight w:val="white"/>
           <w:lang w:val="ru-RU" w:eastAsia="ru-RU" w:bidi="ar-SA"/>
         </w:rPr>
-        <w:t>concurrency::parallel_r</w:t>
-      </w:r>
-      <w:bookmarkStart w:id="0" w:name="_GoBack"/>
-      <w:bookmarkEnd w:id="0"/>
+        <w:t>::</w:t>
+      </w:r>
+      <w:proofErr w:type="spellStart"/>
       <w:r>
         <w:rPr>
           <w:rFonts w:ascii="Consolas" w:hAnsi="Consolas" w:cs="Consolas"/>
@@ -274,8 +299,75 @@
           <w:highlight w:val="white"/>
           <w:lang w:val="ru-RU" w:eastAsia="ru-RU" w:bidi="ar-SA"/>
         </w:rPr>
-        <w:t>adixsort</w:t>
-      </w:r>
+        <w:t>parallel_buffered_sort</w:t>
+      </w:r>
+      <w:proofErr w:type="spellEnd"/>
+      <w:r>
+        <w:rPr>
+          <w:rFonts w:ascii="Consolas" w:hAnsi="Consolas" w:cs="Consolas"/>
+          <w:color w:val="000000"/>
+          <w:sz w:val="28"/>
+          <w:szCs w:val="28"/>
+          <w:lang w:val="ru-RU" w:eastAsia="ru-RU" w:bidi="ar-SA"/>
+        </w:rPr>
+        <w:t xml:space="preserve"> </w:t>
+      </w:r>
+      <w:r>
+        <w:rPr>
+          <w:color w:val="000000"/>
+          <w:sz w:val="28"/>
+          <w:szCs w:val="28"/>
+          <w:lang w:val="ru-RU" w:eastAsia="ru-RU" w:bidi="ar-SA"/>
+        </w:rPr>
+        <w:t>и</w:t>
+      </w:r>
+      <w:r>
+        <w:rPr>
+          <w:rFonts w:ascii="Consolas" w:hAnsi="Consolas" w:cs="Consolas"/>
+          <w:color w:val="000000"/>
+          <w:sz w:val="28"/>
+          <w:szCs w:val="28"/>
+          <w:lang w:val="ru-RU" w:eastAsia="ru-RU" w:bidi="ar-SA"/>
+        </w:rPr>
+        <w:t xml:space="preserve"> </w:t>
+      </w:r>
+      <w:proofErr w:type="spellStart"/>
+      <w:r>
+        <w:rPr>
+          <w:rFonts w:ascii="Consolas" w:hAnsi="Consolas" w:cs="Consolas"/>
+          <w:color w:val="000000"/>
+          <w:sz w:val="28"/>
+          <w:szCs w:val="28"/>
+          <w:highlight w:val="white"/>
+          <w:lang w:val="ru-RU" w:eastAsia="ru-RU" w:bidi="ar-SA"/>
+        </w:rPr>
+        <w:t>concurrency</w:t>
+      </w:r>
+      <w:proofErr w:type="spellEnd"/>
+      <w:r>
+        <w:rPr>
+          <w:rFonts w:ascii="Consolas" w:hAnsi="Consolas" w:cs="Consolas"/>
+          <w:color w:val="000000"/>
+          <w:sz w:val="28"/>
+          <w:szCs w:val="28"/>
+          <w:highlight w:val="white"/>
+          <w:lang w:val="ru-RU" w:eastAsia="ru-RU" w:bidi="ar-SA"/>
+        </w:rPr>
+        <w:t>::</w:t>
+      </w:r>
+      <w:proofErr w:type="spellStart"/>
+      <w:r>
+        <w:rPr>
+          <w:rFonts w:ascii="Consolas" w:hAnsi="Consolas" w:cs="Consolas"/>
+          <w:color w:val="000000"/>
+          <w:sz w:val="28"/>
+          <w:szCs w:val="28"/>
+          <w:highlight w:val="white"/>
+          <w:lang w:val="ru-RU" w:eastAsia="ru-RU" w:bidi="ar-SA"/>
+        </w:rPr>
+        <w:t>parallel_radixsort</w:t>
+      </w:r>
+      <w:proofErr w:type="spellEnd"/>
       <w:r>
         <w:rPr>
           <w:sz w:val="28"/>
@@ -332,6 +424,7 @@
         </w:rPr>
         <w:t xml:space="preserve"> </w:t>
       </w:r>
+      <w:proofErr w:type="gramStart"/>
       <w:r>
         <w:rPr>
           <w:rFonts w:ascii="Consolas" w:hAnsi="Consolas" w:cs="Consolas"/>
@@ -349,6 +442,7 @@
         </w:rPr>
         <w:t>::</w:t>
       </w:r>
+      <w:proofErr w:type="gramEnd"/>
       <w:r>
         <w:rPr>
           <w:rFonts w:ascii="Consolas" w:hAnsi="Consolas" w:cs="Consolas"/>
@@ -393,13 +487,13 @@
       </w:pPr>
       <w:r>
         <w:rPr>
-          <w:position w:val="-14"/>
-        </w:rPr>
-        <w:object w:dxaOrig="2340" w:dyaOrig="460">
-          <v:shape id="_x0000_i1027" type="#_x0000_t75" style="width:117pt;height:24pt" o:ole="">
+          <w:position w:val="-18"/>
+        </w:rPr>
+        <w:object w:dxaOrig="2360" w:dyaOrig="499" w14:anchorId="05C5E832">
+          <v:shape id="_x0000_i1040" type="#_x0000_t75" style="width:117.75pt;height:26.25pt" o:ole="">
             <v:imagedata r:id="rId11" o:title=""/>
           </v:shape>
-          <o:OLEObject Type="Embed" ProgID="Equation.DSMT4" ShapeID="_x0000_i1027" DrawAspect="Content" ObjectID="_1537775447" r:id="rId12"/>
+          <o:OLEObject Type="Embed" ProgID="Equation.DSMT4" ShapeID="_x0000_i1040" DrawAspect="Content" ObjectID="_1851605254" r:id="rId12"/>
         </w:object>
       </w:r>
       <w:r>
@@ -417,13 +511,13 @@
       </w:pPr>
       <w:r>
         <w:rPr>
-          <w:position w:val="-14"/>
-        </w:rPr>
-        <w:object w:dxaOrig="2299" w:dyaOrig="460">
-          <v:shape id="_x0000_i1028" type="#_x0000_t75" style="width:115pt;height:24pt" o:ole="">
+          <w:position w:val="-18"/>
+        </w:rPr>
+        <w:object w:dxaOrig="2340" w:dyaOrig="499" w14:anchorId="14698076">
+          <v:shape id="_x0000_i1042" type="#_x0000_t75" style="width:117pt;height:26.25pt" o:ole="">
             <v:imagedata r:id="rId13" o:title=""/>
           </v:shape>
-          <o:OLEObject Type="Embed" ProgID="Equation.DSMT4" ShapeID="_x0000_i1028" DrawAspect="Content" ObjectID="_1537775448" r:id="rId14"/>
+          <o:OLEObject Type="Embed" ProgID="Equation.DSMT4" ShapeID="_x0000_i1042" DrawAspect="Content" ObjectID="_1851605255" r:id="rId14"/>
         </w:object>
       </w:r>
     </w:p>
@@ -442,13 +536,13 @@
       </w:pPr>
       <w:r>
         <w:rPr>
-          <w:position w:val="-30"/>
-        </w:rPr>
-        <w:object w:dxaOrig="3060" w:dyaOrig="780">
-          <v:shape id="_x0000_i1029" type="#_x0000_t75" style="width:153pt;height:39pt" o:ole="">
+          <w:position w:val="-28"/>
+        </w:rPr>
+        <w:object w:dxaOrig="3040" w:dyaOrig="760" w14:anchorId="2E71EE7C">
+          <v:shape id="_x0000_i1044" type="#_x0000_t75" style="width:152.25pt;height:38.25pt" o:ole="">
             <v:imagedata r:id="rId15" o:title=""/>
           </v:shape>
-          <o:OLEObject Type="Embed" ProgID="Equation.DSMT4" ShapeID="_x0000_i1029" DrawAspect="Content" ObjectID="_1537775449" r:id="rId16"/>
+          <o:OLEObject Type="Embed" ProgID="Equation.DSMT4" ShapeID="_x0000_i1044" DrawAspect="Content" ObjectID="_1851605256" r:id="rId16"/>
         </w:object>
       </w:r>
     </w:p>
@@ -462,13 +556,13 @@
       </w:pPr>
       <w:r>
         <w:rPr>
-          <w:position w:val="-30"/>
-        </w:rPr>
-        <w:object w:dxaOrig="3019" w:dyaOrig="780">
-          <v:shape id="_x0000_i1030" type="#_x0000_t75" style="width:151pt;height:39pt" o:ole="">
+          <w:position w:val="-28"/>
+        </w:rPr>
+        <w:object w:dxaOrig="3019" w:dyaOrig="760" w14:anchorId="63D6C6B0">
+          <v:shape id="_x0000_i1046" type="#_x0000_t75" style="width:150.75pt;height:38.25pt" o:ole="">
             <v:imagedata r:id="rId17" o:title=""/>
           </v:shape>
-          <o:OLEObject Type="Embed" ProgID="Equation.DSMT4" ShapeID="_x0000_i1030" DrawAspect="Content" ObjectID="_1537775450" r:id="rId18"/>
+          <o:OLEObject Type="Embed" ProgID="Equation.DSMT4" ShapeID="_x0000_i1046" DrawAspect="Content" ObjectID="_1851605257" r:id="rId18"/>
         </w:object>
       </w:r>
     </w:p>
@@ -482,13 +576,13 @@
       </w:pPr>
       <w:r>
         <w:rPr>
-          <w:position w:val="-32"/>
-        </w:rPr>
-        <w:object w:dxaOrig="3159" w:dyaOrig="820">
-          <v:shape id="_x0000_i1031" type="#_x0000_t75" style="width:158pt;height:41pt" o:ole="">
+          <w:position w:val="-30"/>
+        </w:rPr>
+        <w:object w:dxaOrig="3159" w:dyaOrig="800" w14:anchorId="41913E41">
+          <v:shape id="_x0000_i1048" type="#_x0000_t75" style="width:158.25pt;height:39.75pt" o:ole="">
             <v:imagedata r:id="rId19" o:title=""/>
           </v:shape>
-          <o:OLEObject Type="Embed" ProgID="Equation.DSMT4" ShapeID="_x0000_i1031" DrawAspect="Content" ObjectID="_1537775451" r:id="rId20"/>
+          <o:OLEObject Type="Embed" ProgID="Equation.DSMT4" ShapeID="_x0000_i1048" DrawAspect="Content" ObjectID="_1851605258" r:id="rId20"/>
         </w:object>
       </w:r>
     </w:p>
@@ -502,13 +596,13 @@
       </w:pPr>
       <w:r>
         <w:rPr>
-          <w:position w:val="-32"/>
-        </w:rPr>
-        <w:object w:dxaOrig="3140" w:dyaOrig="820">
-          <v:shape id="_x0000_i1032" type="#_x0000_t75" style="width:157pt;height:41pt" o:ole="">
+          <w:position w:val="-30"/>
+        </w:rPr>
+        <w:object w:dxaOrig="3140" w:dyaOrig="800" w14:anchorId="7C0E282A">
+          <v:shape id="_x0000_i1050" type="#_x0000_t75" style="width:156.75pt;height:39.75pt" o:ole="">
             <v:imagedata r:id="rId21" o:title=""/>
           </v:shape>
-          <o:OLEObject Type="Embed" ProgID="Equation.DSMT4" ShapeID="_x0000_i1032" DrawAspect="Content" ObjectID="_1537775452" r:id="rId22"/>
+          <o:OLEObject Type="Embed" ProgID="Equation.DSMT4" ShapeID="_x0000_i1050" DrawAspect="Content" ObjectID="_1851605259" r:id="rId22"/>
         </w:object>
       </w:r>
     </w:p>
@@ -522,13 +616,13 @@
       </w:pPr>
       <w:r>
         <w:rPr>
-          <w:position w:val="-36"/>
-        </w:rPr>
-        <w:object w:dxaOrig="3260" w:dyaOrig="900">
-          <v:shape id="_x0000_i1033" type="#_x0000_t75" style="width:163pt;height:45pt" o:ole="">
+          <w:position w:val="-34"/>
+        </w:rPr>
+        <w:object w:dxaOrig="3260" w:dyaOrig="880" w14:anchorId="4627CA52">
+          <v:shape id="_x0000_i1052" type="#_x0000_t75" style="width:162.75pt;height:44.25pt" o:ole="">
             <v:imagedata r:id="rId23" o:title=""/>
           </v:shape>
-          <o:OLEObject Type="Embed" ProgID="Equation.DSMT4" ShapeID="_x0000_i1033" DrawAspect="Content" ObjectID="_1537775453" r:id="rId24"/>
+          <o:OLEObject Type="Embed" ProgID="Equation.DSMT4" ShapeID="_x0000_i1052" DrawAspect="Content" ObjectID="_1851605260" r:id="rId24"/>
         </w:object>
       </w:r>
     </w:p>
@@ -542,13 +636,13 @@
       </w:pPr>
       <w:r>
         <w:rPr>
-          <w:position w:val="-36"/>
-        </w:rPr>
-        <w:object w:dxaOrig="3240" w:dyaOrig="900">
-          <v:shape id="_x0000_i1034" type="#_x0000_t75" style="width:162pt;height:45pt" o:ole="">
+          <w:position w:val="-34"/>
+        </w:rPr>
+        <w:object w:dxaOrig="3240" w:dyaOrig="880" w14:anchorId="7F897763">
+          <v:shape id="_x0000_i1054" type="#_x0000_t75" style="width:162pt;height:44.25pt" o:ole="">
             <v:imagedata r:id="rId25" o:title=""/>
           </v:shape>
-          <o:OLEObject Type="Embed" ProgID="Equation.DSMT4" ShapeID="_x0000_i1034" DrawAspect="Content" ObjectID="_1537775454" r:id="rId26"/>
+          <o:OLEObject Type="Embed" ProgID="Equation.DSMT4" ShapeID="_x0000_i1054" DrawAspect="Content" ObjectID="_1851605261" r:id="rId26"/>
         </w:object>
       </w:r>
     </w:p>
@@ -562,13 +656,13 @@
       </w:pPr>
       <w:r>
         <w:rPr>
-          <w:position w:val="-38"/>
-        </w:rPr>
-        <w:object w:dxaOrig="2880" w:dyaOrig="900">
-          <v:shape id="_x0000_i1035" type="#_x0000_t75" style="width:2in;height:45pt" o:ole="">
+          <w:position w:val="-40"/>
+        </w:rPr>
+        <w:object w:dxaOrig="2880" w:dyaOrig="940" w14:anchorId="57B61BBB">
+          <v:shape id="_x0000_i1061" type="#_x0000_t75" style="width:2in;height:47.25pt" o:ole="">
             <v:imagedata r:id="rId27" o:title=""/>
           </v:shape>
-          <o:OLEObject Type="Embed" ProgID="Equation.DSMT4" ShapeID="_x0000_i1035" DrawAspect="Content" ObjectID="_1537775455" r:id="rId28"/>
+          <o:OLEObject Type="Embed" ProgID="Equation.DSMT4" ShapeID="_x0000_i1061" DrawAspect="Content" ObjectID="_1851605262" r:id="rId28"/>
         </w:object>
       </w:r>
     </w:p>
@@ -582,13 +676,13 @@
       </w:pPr>
       <w:r>
         <w:rPr>
-          <w:position w:val="-38"/>
-        </w:rPr>
-        <w:object w:dxaOrig="2860" w:dyaOrig="900">
-          <v:shape id="_x0000_i1036" type="#_x0000_t75" style="width:143pt;height:45pt" o:ole="">
+          <w:position w:val="-40"/>
+        </w:rPr>
+        <w:object w:dxaOrig="2860" w:dyaOrig="940" w14:anchorId="0052BE10">
+          <v:shape id="_x0000_i1063" type="#_x0000_t75" style="width:143.25pt;height:47.25pt" o:ole="">
             <v:imagedata r:id="rId29" o:title=""/>
           </v:shape>
-          <o:OLEObject Type="Embed" ProgID="Equation.DSMT4" ShapeID="_x0000_i1036" DrawAspect="Content" ObjectID="_1537775456" r:id="rId30"/>
+          <o:OLEObject Type="Embed" ProgID="Equation.DSMT4" ShapeID="_x0000_i1063" DrawAspect="Content" ObjectID="_1851605263" r:id="rId30"/>
         </w:object>
       </w:r>
     </w:p>
@@ -602,16 +696,17 @@
       </w:pPr>
       <w:r>
         <w:rPr>
-          <w:position w:val="-42"/>
-        </w:rPr>
-        <w:object w:dxaOrig="3100" w:dyaOrig="980">
-          <v:shape id="_x0000_i1037" type="#_x0000_t75" style="width:155pt;height:49pt" o:ole="">
+          <w:position w:val="-44"/>
+        </w:rPr>
+        <w:object w:dxaOrig="3100" w:dyaOrig="1020" w14:anchorId="01521939">
+          <v:shape id="_x0000_i1065" type="#_x0000_t75" style="width:155.25pt;height:51pt" o:ole="">
             <v:imagedata r:id="rId31" o:title=""/>
           </v:shape>
-          <o:OLEObject Type="Embed" ProgID="Equation.DSMT4" ShapeID="_x0000_i1037" DrawAspect="Content" ObjectID="_1537775457" r:id="rId32"/>
+          <o:OLEObject Type="Embed" ProgID="Equation.DSMT4" ShapeID="_x0000_i1065" DrawAspect="Content" ObjectID="_1851605264" r:id="rId32"/>
         </w:object>
       </w:r>
     </w:p>
+    <w:bookmarkStart w:id="0" w:name="_GoBack"/>
     <w:p>
       <w:pPr>
         <w:pStyle w:val="aa"/>
@@ -622,15 +717,16 @@
       </w:pPr>
       <w:r>
         <w:rPr>
-          <w:position w:val="-42"/>
-        </w:rPr>
-        <w:object w:dxaOrig="3080" w:dyaOrig="980">
-          <v:shape id="_x0000_i1038" type="#_x0000_t75" style="width:154pt;height:49pt" o:ole="">
+          <w:position w:val="-44"/>
+        </w:rPr>
+        <w:object w:dxaOrig="3060" w:dyaOrig="1020" w14:anchorId="459E5608">
+          <v:shape id="_x0000_i1067" type="#_x0000_t75" style="width:153pt;height:51pt" o:ole="">
             <v:imagedata r:id="rId33" o:title=""/>
           </v:shape>
-          <o:OLEObject Type="Embed" ProgID="Equation.DSMT4" ShapeID="_x0000_i1038" DrawAspect="Content" ObjectID="_1537775458" r:id="rId34"/>
+          <o:OLEObject Type="Embed" ProgID="Equation.DSMT4" ShapeID="_x0000_i1067" DrawAspect="Content" ObjectID="_1851605265" r:id="rId34"/>
         </w:object>
       </w:r>
+      <w:bookmarkEnd w:id="0"/>
     </w:p>
     <w:sectPr>
       <w:pgSz w:w="11906" w:h="16838"/>
@@ -643,7 +739,7 @@
 </file>
 
 <file path=word/endnotes.xml><?xml version="1.0" encoding="utf-8"?>
-<w:endnotes xmlns:wpc="http://schemas.microsoft.com/office/word/2010/wordprocessingCanvas" xmlns:mc="http://schemas.openxmlformats.org/markup-compatibility/2006" xmlns:o="urn:schemas-microsoft-com:office:office" xmlns:r="http://schemas.openxmlformats.org/officeDocument/2006/relationships" xmlns:m="http://schemas.openxmlformats.org/officeDocument/2006/math" xmlns:v="urn:schemas-microsoft-com:vml" xmlns:wp14="http://schemas.microsoft.com/office/word/2010/wordprocessingDrawing" xmlns:wp="http://schemas.openxmlformats.org/drawingml/2006/wordprocessingDrawing" xmlns:w10="urn:schemas-microsoft-com:office:word" xmlns:w="http://schemas.openxmlformats.org/wordprocessingml/2006/main" xmlns:w14="http://schemas.microsoft.com/office/word/2010/wordml" xmlns:w15="http://schemas.microsoft.com/office/word/2012/wordml" xmlns:wpg="http://schemas.microsoft.com/office/word/2010/wordprocessingGroup" xmlns:wpi="http://schemas.microsoft.com/office/word/2010/wordprocessingInk" xmlns:wne="http://schemas.microsoft.com/office/word/2006/wordml" xmlns:wps="http://schemas.microsoft.com/office/word/2010/wordprocessingShape" mc:Ignorable="w14 w15 wp14">
+<w:endnotes xmlns:wpc="http://schemas.microsoft.com/office/word/2010/wordprocessingCanvas" xmlns:cx="http://schemas.microsoft.com/office/drawing/2014/chartex" xmlns:cx1="http://schemas.microsoft.com/office/drawing/2015/9/8/chartex" xmlns:cx2="http://schemas.microsoft.com/office/drawing/2015/10/21/chartex" xmlns:cx3="http://schemas.microsoft.com/office/drawing/2016/5/9/chartex" xmlns:cx4="http://schemas.microsoft.com/office/drawing/2016/5/10/chartex" xmlns:cx5="http://schemas.microsoft.com/office/drawing/2016/5/11/chartex" xmlns:cx6="http://schemas.microsoft.com/office/drawing/2016/5/12/chartex" xmlns:cx7="http://schemas.microsoft.com/office/drawing/2016/5/13/chartex" xmlns:cx8="http://schemas.microsoft.com/office/drawing/2016/5/14/chartex" xmlns:mc="http://schemas.openxmlformats.org/markup-compatibility/2006" xmlns:aink="http://schemas.microsoft.com/office/drawing/2016/ink" xmlns:am3d="http://schemas.microsoft.com/office/drawing/2017/model3d" xmlns:o="urn:schemas-microsoft-com:office:office" xmlns:r="http://schemas.openxmlformats.org/officeDocument/2006/relationships" xmlns:m="http://schemas.openxmlformats.org/officeDocument/2006/math" xmlns:v="urn:schemas-microsoft-com:vml" xmlns:wp14="http://schemas.microsoft.com/office/word/2010/wordprocessingDrawing" xmlns:wp="http://schemas.openxmlformats.org/drawingml/2006/wordprocessingDrawing" xmlns:w10="urn:schemas-microsoft-com:office:word" xmlns:w="http://schemas.openxmlformats.org/wordprocessingml/2006/main" xmlns:w14="http://schemas.microsoft.com/office/word/2010/wordml" xmlns:w15="http://schemas.microsoft.com/office/word/2012/wordml" xmlns:w16cid="http://schemas.microsoft.com/office/word/2016/wordml/cid" xmlns:w16se="http://schemas.microsoft.com/office/word/2015/wordml/symex" xmlns:wpg="http://schemas.microsoft.com/office/word/2010/wordprocessingGroup" xmlns:wpi="http://schemas.microsoft.com/office/word/2010/wordprocessingInk" xmlns:wne="http://schemas.microsoft.com/office/word/2006/wordml" xmlns:wps="http://schemas.microsoft.com/office/word/2010/wordprocessingShape" mc:Ignorable="w14 w15 w16se w16cid wp14">
   <w:endnote w:type="separator" w:id="-1">
     <w:p>
       <w:r>
@@ -662,7 +758,7 @@
 </file>
 
 <file path=word/footnotes.xml><?xml version="1.0" encoding="utf-8"?>
-<w:footnotes xmlns:wpc="http://schemas.microsoft.com/office/word/2010/wordprocessingCanvas" xmlns:mc="http://schemas.openxmlformats.org/markup-compatibility/2006" xmlns:o="urn:schemas-microsoft-com:office:office" xmlns:r="http://schemas.openxmlformats.org/officeDocument/2006/relationships" xmlns:m="http://schemas.openxmlformats.org/officeDocument/2006/math" xmlns:v="urn:schemas-microsoft-com:vml" xmlns:wp14="http://schemas.microsoft.com/office/word/2010/wordprocessingDrawing" xmlns:wp="http://schemas.openxmlformats.org/drawingml/2006/wordprocessingDrawing" xmlns:w10="urn:schemas-microsoft-com:office:word" xmlns:w="http://schemas.openxmlformats.org/wordprocessingml/2006/main" xmlns:w14="http://schemas.microsoft.com/office/word/2010/wordml" xmlns:w15="http://schemas.microsoft.com/office/word/2012/wordml" xmlns:wpg="http://schemas.microsoft.com/office/word/2010/wordprocessingGroup" xmlns:wpi="http://schemas.microsoft.com/office/word/2010/wordprocessingInk" xmlns:wne="http://schemas.microsoft.com/office/word/2006/wordml" xmlns:wps="http://schemas.microsoft.com/office/word/2010/wordprocessingShape" mc:Ignorable="w14 w15 wp14">
+<w:footnotes xmlns:wpc="http://schemas.microsoft.com/office/word/2010/wordprocessingCanvas" xmlns:cx="http://schemas.microsoft.com/office/drawing/2014/chartex" xmlns:cx1="http://schemas.microsoft.com/office/drawing/2015/9/8/chartex" xmlns:cx2="http://schemas.microsoft.com/office/drawing/2015/10/21/chartex" xmlns:cx3="http://schemas.microsoft.com/office/drawing/2016/5/9/chartex" xmlns:cx4="http://schemas.microsoft.com/office/drawing/2016/5/10/chartex" xmlns:cx5="http://schemas.microsoft.com/office/drawing/2016/5/11/chartex" xmlns:cx6="http://schemas.microsoft.com/office/drawing/2016/5/12/chartex" xmlns:cx7="http://schemas.microsoft.com/office/drawing/2016/5/13/chartex" xmlns:cx8="http://schemas.microsoft.com/office/drawing/2016/5/14/chartex" xmlns:mc="http://schemas.openxmlformats.org/markup-compatibility/2006" xmlns:aink="http://schemas.microsoft.com/office/drawing/2016/ink" xmlns:am3d="http://schemas.microsoft.com/office/drawing/2017/model3d" xmlns:o="urn:schemas-microsoft-com:office:office" xmlns:r="http://schemas.openxmlformats.org/officeDocument/2006/relationships" xmlns:m="http://schemas.openxmlformats.org/officeDocument/2006/math" xmlns:v="urn:schemas-microsoft-com:vml" xmlns:wp14="http://schemas.microsoft.com/office/word/2010/wordprocessingDrawing" xmlns:wp="http://schemas.openxmlformats.org/drawingml/2006/wordprocessingDrawing" xmlns:w10="urn:schemas-microsoft-com:office:word" xmlns:w="http://schemas.openxmlformats.org/wordprocessingml/2006/main" xmlns:w14="http://schemas.microsoft.com/office/word/2010/wordml" xmlns:w15="http://schemas.microsoft.com/office/word/2012/wordml" xmlns:w16cid="http://schemas.microsoft.com/office/word/2016/wordml/cid" xmlns:w16se="http://schemas.microsoft.com/office/word/2015/wordml/symex" xmlns:wpg="http://schemas.microsoft.com/office/word/2010/wordprocessingGroup" xmlns:wpi="http://schemas.microsoft.com/office/word/2010/wordprocessingInk" xmlns:wne="http://schemas.microsoft.com/office/word/2006/wordml" xmlns:wps="http://schemas.microsoft.com/office/word/2010/wordprocessingShape" mc:Ignorable="w14 w15 w16se w16cid wp14">
   <w:footnote w:type="separator" w:id="-1">
     <w:p>
       <w:r>
@@ -681,7 +777,7 @@
 </file>
 
 <file path=word/numbering.xml><?xml version="1.0" encoding="utf-8"?>
-<w:numbering xmlns:wpc="http://schemas.microsoft.com/office/word/2010/wordprocessingCanvas" xmlns:mc="http://schemas.openxmlformats.org/markup-compatibility/2006" xmlns:o="urn:schemas-microsoft-com:office:office" xmlns:r="http://schemas.openxmlformats.org/officeDocument/2006/relationships" xmlns:m="http://schemas.openxmlformats.org/officeDocument/2006/math" xmlns:v="urn:schemas-microsoft-com:vml" xmlns:wp14="http://schemas.microsoft.com/office/word/2010/wordprocessingDrawing" xmlns:wp="http://schemas.openxmlformats.org/drawingml/2006/wordprocessingDrawing" xmlns:w10="urn:schemas-microsoft-com:office:word" xmlns:w="http://schemas.openxmlformats.org/wordprocessingml/2006/main" xmlns:w14="http://schemas.microsoft.com/office/word/2010/wordml" xmlns:w15="http://schemas.microsoft.com/office/word/2012/wordml" xmlns:wpg="http://schemas.microsoft.com/office/word/2010/wordprocessingGroup" xmlns:wpi="http://schemas.microsoft.com/office/word/2010/wordprocessingInk" xmlns:wne="http://schemas.microsoft.com/office/word/2006/wordml" xmlns:wps="http://schemas.microsoft.com/office/word/2010/wordprocessingShape" mc:Ignorable="w14 w15 wp14">
+<w:numbering xmlns:wpc="http://schemas.microsoft.com/office/word/2010/wordprocessingCanvas" xmlns:cx="http://schemas.microsoft.com/office/drawing/2014/chartex" xmlns:cx1="http://schemas.microsoft.com/office/drawing/2015/9/8/chartex" xmlns:cx2="http://schemas.microsoft.com/office/drawing/2015/10/21/chartex" xmlns:cx3="http://schemas.microsoft.com/office/drawing/2016/5/9/chartex" xmlns:cx4="http://schemas.microsoft.com/office/drawing/2016/5/10/chartex" xmlns:cx5="http://schemas.microsoft.com/office/drawing/2016/5/11/chartex" xmlns:cx6="http://schemas.microsoft.com/office/drawing/2016/5/12/chartex" xmlns:cx7="http://schemas.microsoft.com/office/drawing/2016/5/13/chartex" xmlns:cx8="http://schemas.microsoft.com/office/drawing/2016/5/14/chartex" xmlns:mc="http://schemas.openxmlformats.org/markup-compatibility/2006" xmlns:aink="http://schemas.microsoft.com/office/drawing/2016/ink" xmlns:am3d="http://schemas.microsoft.com/office/drawing/2017/model3d" xmlns:o="urn:schemas-microsoft-com:office:office" xmlns:r="http://schemas.openxmlformats.org/officeDocument/2006/relationships" xmlns:m="http://schemas.openxmlformats.org/officeDocument/2006/math" xmlns:v="urn:schemas-microsoft-com:vml" xmlns:wp14="http://schemas.microsoft.com/office/word/2010/wordprocessingDrawing" xmlns:wp="http://schemas.openxmlformats.org/drawingml/2006/wordprocessingDrawing" xmlns:w10="urn:schemas-microsoft-com:office:word" xmlns:w="http://schemas.openxmlformats.org/wordprocessingml/2006/main" xmlns:w14="http://schemas.microsoft.com/office/word/2010/wordml" xmlns:w15="http://schemas.microsoft.com/office/word/2012/wordml" xmlns:w16cid="http://schemas.microsoft.com/office/word/2016/wordml/cid" xmlns:w16se="http://schemas.microsoft.com/office/word/2015/wordml/symex" xmlns:wpg="http://schemas.microsoft.com/office/word/2010/wordprocessingGroup" xmlns:wpi="http://schemas.microsoft.com/office/word/2010/wordprocessingInk" xmlns:wne="http://schemas.microsoft.com/office/word/2006/wordml" xmlns:wps="http://schemas.microsoft.com/office/word/2010/wordprocessingShape" mc:Ignorable="w14 w15 w16se w16cid wp14">
   <w:abstractNum w:abstractNumId="0" w15:restartNumberingAfterBreak="0">
     <w:nsid w:val="351A5C06"/>
     <w:multiLevelType w:val="hybridMultilevel"/>
@@ -956,7 +1052,7 @@
 </file>
 
 <file path=word/styles.xml><?xml version="1.0" encoding="utf-8"?>
-<w:styles xmlns:mc="http://schemas.openxmlformats.org/markup-compatibility/2006" xmlns:r="http://schemas.openxmlformats.org/officeDocument/2006/relationships" xmlns:w="http://schemas.openxmlformats.org/wordprocessingml/2006/main" xmlns:w14="http://schemas.microsoft.com/office/word/2010/wordml" xmlns:w15="http://schemas.microsoft.com/office/word/2012/wordml" mc:Ignorable="w14 w15">
+<w:styles xmlns:mc="http://schemas.openxmlformats.org/markup-compatibility/2006" xmlns:r="http://schemas.openxmlformats.org/officeDocument/2006/relationships" xmlns:w="http://schemas.openxmlformats.org/wordprocessingml/2006/main" xmlns:w14="http://schemas.microsoft.com/office/word/2010/wordml" xmlns:w15="http://schemas.microsoft.com/office/word/2012/wordml" xmlns:w16cid="http://schemas.microsoft.com/office/word/2016/wordml/cid" xmlns:w16se="http://schemas.microsoft.com/office/word/2015/wordml/symex" mc:Ignorable="w14 w15 w16se w16cid">
   <w:docDefaults>
     <w:rPrDefault>
       <w:rPr>
@@ -966,7 +1062,7 @@
     </w:rPrDefault>
     <w:pPrDefault/>
   </w:docDefaults>
-  <w:latentStyles w:defLockedState="0" w:defUIPriority="99" w:defSemiHidden="0" w:defUnhideWhenUsed="0" w:defQFormat="0" w:count="371">
+  <w:latentStyles w:defLockedState="0" w:defUIPriority="99" w:defSemiHidden="0" w:defUnhideWhenUsed="0" w:defQFormat="0" w:count="377">
     <w:lsdException w:name="Normal" w:uiPriority="0" w:qFormat="1"/>
     <w:lsdException w:name="heading 1" w:uiPriority="9" w:qFormat="1"/>
     <w:lsdException w:name="heading 2" w:semiHidden="1" w:uiPriority="9" w:unhideWhenUsed="1" w:qFormat="1"/>
@@ -1114,11 +1210,8 @@
     <w:lsdException w:name="Table 3D effects 3" w:semiHidden="1" w:unhideWhenUsed="1"/>
     <w:lsdException w:name="Table Contemporary" w:semiHidden="1" w:unhideWhenUsed="1"/>
     <w:lsdException w:name="Table Elegant" w:semiHidden="1" w:unhideWhenUsed="1"/>
-    <w:lsdException w:name="Table Professional" w:semiHidden="1" w:unhideWhenUsed="1"/>
     <w:lsdException w:name="Table Subtle 1" w:semiHidden="1" w:unhideWhenUsed="1"/>
     <w:lsdException w:name="Table Subtle 2" w:semiHidden="1" w:unhideWhenUsed="1"/>
-    <w:lsdException w:name="Table Web 1" w:semiHidden="1" w:unhideWhenUsed="1"/>
-    <w:lsdException w:name="Table Web 2" w:semiHidden="1" w:unhideWhenUsed="1"/>
     <w:lsdException w:name="Table Web 3" w:semiHidden="1" w:unhideWhenUsed="1"/>
     <w:lsdException w:name="Balloon Text" w:semiHidden="1" w:unhideWhenUsed="1"/>
     <w:lsdException w:name="Table Grid" w:uiPriority="59"/>
@@ -1338,6 +1431,12 @@
     <w:lsdException w:name="List Table 5 Dark Accent 6" w:uiPriority="50"/>
     <w:lsdException w:name="List Table 6 Colorful Accent 6" w:uiPriority="51"/>
     <w:lsdException w:name="List Table 7 Colorful Accent 6" w:uiPriority="52"/>
+    <w:lsdException w:name="Mention" w:semiHidden="1" w:unhideWhenUsed="1"/>
+    <w:lsdException w:name="Smart Hyperlink" w:semiHidden="1" w:unhideWhenUsed="1"/>
+    <w:lsdException w:name="Hashtag" w:semiHidden="1" w:unhideWhenUsed="1"/>
+    <w:lsdException w:name="Unresolved Mention" w:semiHidden="1" w:unhideWhenUsed="1"/>
+    <w:lsdException w:name="Smart Link" w:semiHidden="1" w:unhideWhenUsed="1"/>
+    <w:lsdException w:name="Smart Link Error" w:semiHidden="1" w:unhideWhenUsed="1"/>
   </w:latentStyles>
   <w:style w:type="paragraph" w:default="1" w:styleId="a">
     <w:name w:val="Normal"/>
@@ -1729,7 +1828,7 @@
     </w:rPr>
   </w:style>
   <w:style w:type="character" w:customStyle="1" w:styleId="a4">
-    <w:name w:val="Название Знак"/>
+    <w:name w:val="Заголовок Знак"/>
     <w:basedOn w:val="a0"/>
     <w:link w:val="a3"/>
     <w:uiPriority w:val="10"/>

</xml_diff>